<commit_message>
Add second adversarial review; expand historical comparison caveats
- Adversarial Review #2 addresses S-curve interpretation, p-value argument,
  and historical comparison methodology
- Historical comparison caveats section expanded with critical
  apples-to-oranges acknowledgment (benchmark scores vs physical infrastructure)
- Added bounded-score inflation caveat
- Strengthened capability-vs-adoption gap language
- README updated to reference both adversarial reviews

Co-Authored-By: Claude Opus 4.6 <noreply@anthropic.com>
</commit_message>
<xml_diff>
--- a/docs/The_Singularity_Evidence_Package.docx
+++ b/docs/The_Singularity_Evidence_Package.docx
@@ -10754,7 +10754,7 @@
           <w:sz w:val="22"/>
           <w:szCs w:val="22"/>
         </w:rPr>
-        <w:t xml:space="preserve">Comparison limitations: </w:t>
+        <w:t xml:space="preserve">Apples-to-oranges measurement (critical): </w:t>
       </w:r>
       <w:r>
         <w:rPr>
@@ -10763,7 +10763,7 @@
           <w:sz w:val="22"/>
           <w:szCs w:val="22"/>
         </w:rPr>
-        <w:t xml:space="preserve">"Capability range" is measured differently for each technology: household adoption for electrification/internet/smartphones, speed records for aviation, benchmark scores for AI. These are not identical metrics. The comparison illustrates relative speed of transition, not identical phenomena.</w:t>
+        <w:t xml:space="preserve">This comparison measures fundamentally different things across technologies. Electrification, internet, and smartphones track physical infrastructure deployment — laying copper wire, building cell towers, manufacturing devices for billions of people. AI tracks software benchmark scores on standardized tests. Jumping from 10% to 90% accuracy on MMLU is categorically different from connecting 90% of American households to an electrical grid. A fairer AI comparison would track enterprise AI integration rates, AI robotics deployment in physical industries, or data center buildout timelines. On those metrics, AI's transition is still fast but not 13x faster than electrification. This comparison illustrates the speed of capability maturation, not the speed of real-world deployment.</w:t>
       </w:r>
     </w:p>
     <w:p>
@@ -10793,7 +10793,7 @@
           <w:sz w:val="22"/>
           <w:szCs w:val="22"/>
         </w:rPr>
-        <w:t xml:space="preserve">Enterprise AI adoption (20% → 78%, McKinsey 2017-2025) is on a different curve than benchmark capability. The capability transition is faster than the adoption transition, suggesting the infrastructure has outpaced organizational readiness.</w:t>
+        <w:t xml:space="preserve">Enterprise AI adoption (20% → 78%, McKinsey 2017-2025) is on a different curve than benchmark capability. The capability transition is faster than the adoption transition, suggesting the infrastructure has outpaced organizational readiness. This gap is itself evidence that benchmark speed overstates real-world impact speed.</w:t>
       </w:r>
     </w:p>
     <w:p>
@@ -10824,6 +10824,36 @@
           <w:szCs w:val="22"/>
         </w:rPr>
         <w:t xml:space="preserve">We compare AI to technologies that succeeded. Many technologies failed. However, the capital commitment ($660B/year), corporate adoption (78%), and irreversibility indicators suggest AI is past the failure-risk window.</w:t>
+      </w:r>
+    </w:p>
+    <w:p>
+      <w:pPr>
+        <w:pStyle w:val="ListParagraph"/>
+        <w:numPr>
+          <w:ilvl w:val="0"/>
+          <w:numId w:val="2"/>
+        </w:numPr>
+        <w:spacing w:after="80"/>
+      </w:pPr>
+      <w:r>
+        <w:rPr>
+          <w:rFonts w:ascii="Arial" w:cs="Arial" w:eastAsia="Arial" w:hAnsi="Arial"/>
+          <w:b/>
+          <w:bCs/>
+          <w:color w:val="333333"/>
+          <w:sz w:val="22"/>
+          <w:szCs w:val="22"/>
+        </w:rPr>
+        <w:t xml:space="preserve">Bounded-score inflation: </w:t>
+      </w:r>
+      <w:r>
+        <w:rPr>
+          <w:rFonts w:ascii="Arial" w:cs="Arial" w:eastAsia="Arial" w:hAnsi="Arial"/>
+          <w:color w:val="333333"/>
+          <w:sz w:val="22"/>
+          <w:szCs w:val="22"/>
+        </w:rPr>
+        <w:t xml:space="preserve">Benchmark scores are bounded at 100%. When plotted as 10%-to-90% of a 0-100 range, the visual compression is partly an artifact of the scale. Physical technologies had no inherent ceiling, making their transitions appear slower by comparison. The normalized chart is an illustration, not a statistical test.</w:t>
       </w:r>
     </w:p>
     <w:p>

</xml_diff>